<commit_message>
Update research paper acknowledgements and references
</commit_message>
<xml_diff>
--- a/docs/data_center_cooling_report_final_sanitized.docx
+++ b/docs/data_center_cooling_report_final_sanitized.docx
@@ -290,10 +290,8 @@
     </w:p>
     <w:p>
       <w:pPr>
-        <w:widowControl w:val="1"/>
-        <w:spacing w:after="120" w:before="120" w:lineRule="auto"/>
+        <w:spacing w:after="120"/>
         <w:jc w:val="center"/>
-        <w:rPr/>
       </w:pPr>
       <w:r>
         <w:rPr>
@@ -305,20 +303,13 @@
           <w:szCs w:val="22"/>
           <w:rtl w:val="0"/>
         </w:rPr>
-        <w:t xml:space="preserve">Prepared for: Environmental Science &amp; Engineering Studies</w:t>
-      </w:r>
-      <w:r>
-        <w:rPr>
-          <w:rtl w:val="0"/>
-        </w:rPr>
-      </w:r>
-    </w:p>
-    <w:p>
-      <w:pPr>
-        <w:widowControl w:val="1"/>
-        <w:spacing w:after="120" w:before="120" w:lineRule="auto"/>
+        <w:t>Advisor: G. Venkat</w:t>
+      </w:r>
+    </w:p>
+    <w:p>
+      <w:pPr>
+        <w:spacing w:after="120"/>
         <w:jc w:val="center"/>
-        <w:rPr/>
       </w:pPr>
       <w:r>
         <w:rPr>
@@ -330,20 +321,13 @@
           <w:szCs w:val="22"/>
           <w:rtl w:val="0"/>
         </w:rPr>
-        <w:t xml:space="preserve">Research Focus: Data Center Thermal Management</w:t>
-      </w:r>
-      <w:r>
-        <w:rPr>
-          <w:rtl w:val="0"/>
-        </w:rPr>
-      </w:r>
-    </w:p>
-    <w:p>
-      <w:pPr>
-        <w:widowControl w:val="1"/>
-        <w:spacing w:after="120" w:before="120" w:lineRule="auto"/>
+        <w:t>Research conducted under guidance from byteSmart</w:t>
+      </w:r>
+    </w:p>
+    <w:p>
+      <w:pPr>
+        <w:spacing w:after="120"/>
         <w:jc w:val="center"/>
-        <w:rPr/>
       </w:pPr>
       <w:r>
         <w:rPr>
@@ -355,7 +339,77 @@
           <w:szCs w:val="22"/>
           <w:rtl w:val="0"/>
         </w:rPr>
-        <w:t xml:space="preserve">Date: June 2026</w:t>
+        <w:t>Research period: June 22 to August 7, 2026</w:t>
+      </w:r>
+    </w:p>
+    <w:p>
+      <w:pPr>
+        <w:widowControl w:val="1"/>
+        <w:spacing w:after="120" w:before="120" w:lineRule="auto"/>
+        <w:jc w:val="center"/>
+        <w:rPr/>
+      </w:pPr>
+      <w:r>
+        <w:rPr>
+          <w:rFonts w:ascii="Arial" w:cs="Arial" w:eastAsia="Arial" w:hAnsi="Arial"/>
+          <w:b w:val="0"/>
+          <w:bCs w:val="0"/>
+          <w:color w:val="444444"/>
+          <w:sz w:val="22"/>
+          <w:szCs w:val="22"/>
+          <w:rtl w:val="0"/>
+        </w:rPr>
+        <w:t xml:space="preserve">Prepared for: Environmental Science &amp; Engineering Studies</w:t>
+      </w:r>
+      <w:r>
+        <w:rPr>
+          <w:rtl w:val="0"/>
+        </w:rPr>
+      </w:r>
+    </w:p>
+    <w:p>
+      <w:pPr>
+        <w:widowControl w:val="1"/>
+        <w:spacing w:after="120" w:before="120" w:lineRule="auto"/>
+        <w:jc w:val="center"/>
+        <w:rPr/>
+      </w:pPr>
+      <w:r>
+        <w:rPr>
+          <w:rFonts w:ascii="Arial" w:cs="Arial" w:eastAsia="Arial" w:hAnsi="Arial"/>
+          <w:b w:val="0"/>
+          <w:bCs w:val="0"/>
+          <w:color w:val="444444"/>
+          <w:sz w:val="22"/>
+          <w:szCs w:val="22"/>
+          <w:rtl w:val="0"/>
+        </w:rPr>
+        <w:t xml:space="preserve">Research Focus: Data Center Thermal Management</w:t>
+      </w:r>
+      <w:r>
+        <w:rPr>
+          <w:rtl w:val="0"/>
+        </w:rPr>
+      </w:r>
+    </w:p>
+    <w:p>
+      <w:pPr>
+        <w:widowControl w:val="1"/>
+        <w:spacing w:after="120" w:before="120" w:lineRule="auto"/>
+        <w:jc w:val="center"/>
+        <w:rPr/>
+      </w:pPr>
+      <w:r>
+        <w:rPr>
+          <w:rFonts w:ascii="Arial" w:cs="Arial" w:eastAsia="Arial" w:hAnsi="Arial"/>
+          <w:b w:val="0"/>
+          <w:bCs w:val="0"/>
+          <w:color w:val="444444"/>
+          <w:sz w:val="22"/>
+          <w:szCs w:val="22"/>
+          <w:rtl w:val="0"/>
+        </w:rPr>
+        <w:t>Date: August 2026</w:t>
       </w:r>
       <w:r>
         <w:rPr>
@@ -1179,6 +1233,36 @@
     </w:p>
     <w:p>
       <w:pPr>
+        <w:spacing w:after="60"/>
+      </w:pPr>
+      <w:r>
+        <w:rPr>
+          <w:rFonts w:ascii="Arial" w:cs="Arial" w:eastAsia="Arial" w:hAnsi="Arial"/>
+          <w:color w:val="000000"/>
+          <w:sz w:val="22"/>
+          <w:szCs w:val="22"/>
+          <w:rtl w:val="0"/>
+        </w:rPr>
+        <w:t>Acknowledgement  .......  33</w:t>
+      </w:r>
+    </w:p>
+    <w:p>
+      <w:pPr>
+        <w:spacing w:after="60"/>
+      </w:pPr>
+      <w:r>
+        <w:rPr>
+          <w:rFonts w:ascii="Arial" w:cs="Arial" w:eastAsia="Arial" w:hAnsi="Arial"/>
+          <w:color w:val="000000"/>
+          <w:sz w:val="22"/>
+          <w:szCs w:val="22"/>
+          <w:rtl w:val="0"/>
+        </w:rPr>
+        <w:t>Appendix A. Project Implementation Update  .......  34</w:t>
+      </w:r>
+    </w:p>
+    <w:p>
+      <w:pPr>
         <w:widowControl w:val="1"/>
         <w:spacing w:after="60" w:before="60" w:lineRule="auto"/>
         <w:rPr/>
@@ -1191,7 +1275,7 @@
           <w:szCs w:val="22"/>
           <w:rtl w:val="0"/>
         </w:rPr>
-        <w:t>12.  References  .......  34</w:t>
+        <w:t>12.  References  .......  35</w:t>
       </w:r>
       <w:r>
         <w:rPr>
@@ -20070,7 +20154,7 @@
       <w:pPr>
         <w:pStyle w:val="Heading1"/>
         <w:keepNext/>
-        <w:pageBreakBefore/>
+        <w:pageBreakBefore w:val="0"/>
         <w:spacing w:before="240" w:after="80"/>
       </w:pPr>
       <w:r>
@@ -20080,7 +20164,8 @@
           <w:color w:val="2E75B6"/>
           <w:sz w:val="40"/>
         </w:rPr>
-        <w:t>12. References</w:t>
+        <w:rPr/>
+        <w:t>Acknowledgement</w:t>
       </w:r>
     </w:p>
     <w:p>
@@ -20094,20 +20179,147 @@
           <w:color w:val="000000"/>
           <w:sz w:val="22"/>
         </w:rPr>
-        <w:t>The following sources were consulted and cited in the preparation of this report. All sources have been verified for accuracy and currency as of June 2026.</w:t>
-      </w:r>
-    </w:p>
-    <w:p>
-      <w:pPr>
-        <w:numPr>
-          <w:ilvl w:val="0"/>
-          <w:numId w:val="3"/>
-        </w:numPr>
-        <w:spacing w:after="60" w:line="259" w:lineRule="auto"/>
+        <w:t>Event Generator code, dashboard code, database schema, installation procedures, tools, Arduino hardware, and other scripts used were provided by byteSmart. Code was enhanced by AI and deployed. Initial datasets were taken from the public domain, including the Data Center Cold Source Control Dataset from Kaggle.</w:t>
+      </w:r>
+    </w:p>
+    <w:p>
+      <w:r>
+        <w:br w:type="page"/>
+      </w:r>
+    </w:p>
+    <w:p>
+      <w:pPr>
+        <w:pStyle w:val="Heading1"/>
+        <w:keepNext/>
+        <w:pageBreakBefore w:val="0"/>
+        <w:spacing w:before="240" w:after="80"/>
       </w:pPr>
       <w:r>
         <w:rPr>
           <w:rFonts w:ascii="Arial" w:hAnsi="Arial"/>
+          <w:b/>
+          <w:color w:val="2E75B6"/>
+          <w:sz w:val="40"/>
+        </w:rPr>
+        <w:rPr/>
+        <w:t>Appendix A. Project Implementation Update (August 2026)</w:t>
+      </w:r>
+    </w:p>
+    <w:p>
+      <w:pPr/>
+      <w:r>
+        <w:t>After the research report and the three regression analyses were completed, the project was extended into a scenario-aware cooling-data pipeline. This appendix records the implemented components and separates completed pipeline work from work that still requires live validation.</w:t>
+      </w:r>
+    </w:p>
+    <w:p>
+      <w:pPr>
+        <w:spacing w:after="120" w:line="259" w:lineRule="auto"/>
+      </w:pPr>
+      <w:r>
+        <w:rPr>
+          <w:b/>
+        </w:rPr>
+        <w:t xml:space="preserve">Completed event flow: </w:t>
+      </w:r>
+      <w:r>
+        <w:t>The cooling-event generator publishes scenario-aware JSON messages to the isolated MQTT topic devices/cooling/events. A validating subscriber receives those messages and can store accepted events in the separate PostgreSQL cooling_events table, leaving the original telemetry data unchanged.</w:t>
+      </w:r>
+    </w:p>
+    <w:p>
+      <w:pPr>
+        <w:spacing w:after="120" w:line="259" w:lineRule="auto"/>
+      </w:pPr>
+      <w:r>
+        <w:rPr>
+          <w:b/>
+        </w:rPr>
+        <w:t xml:space="preserve">Data captured: </w:t>
+      </w:r>
+      <w:r>
+        <w:t>Exports retain the original cooling-model columns while adding audit fields for scenario, severity, failure point, sensor status, data quality, outlier status, and event identity. This preserves both model compatibility and traceability for normal operation, outliers, workload spikes, cooling failures, and sensor faults.</w:t>
+      </w:r>
+    </w:p>
+    <w:p>
+      <w:pPr>
+        <w:spacing w:after="120" w:line="259" w:lineRule="auto"/>
+      </w:pPr>
+      <w:r>
+        <w:rPr>
+          <w:b/>
+        </w:rPr>
+        <w:t xml:space="preserve">Analysis and export: </w:t>
+      </w:r>
+      <w:r>
+        <w:t>The database-analysis tool summarizes event count, workload, inlet temperature, cooling power, energy cost, control strategy, thermal risk, and unusual events. It can export a training-ready CSV, including an export limited to one generator run.</w:t>
+      </w:r>
+    </w:p>
+    <w:p>
+      <w:pPr>
+        <w:spacing w:after="120" w:line="259" w:lineRule="auto"/>
+      </w:pPr>
+      <w:r>
+        <w:rPr>
+          <w:b/>
+        </w:rPr>
+        <w:t xml:space="preserve">Dashboard boundary: </w:t>
+      </w:r>
+      <w:r>
+        <w:t>The cooling dashboard can validate and import a complete CSV snapshot in the browser. Its raw event stream is intentionally backend-only and depends on the local bridge, the MQTT subscriber, and PostgreSQL; a complete live browser demonstration remains a separate validation step.</w:t>
+      </w:r>
+    </w:p>
+    <w:p>
+      <w:pPr>
+        <w:spacing w:after="120" w:line="259" w:lineRule="auto"/>
+      </w:pPr>
+      <w:r>
+        <w:rPr>
+          <w:b/>
+        </w:rPr>
+        <w:t xml:space="preserve">Retraining boundary: </w:t>
+      </w:r>
+      <w:r>
+        <w:t>A generator CSV or PostgreSQL-confirmed run can be uploaded to the existing Google Colab training notebook. Retraining should be reported only after the run ID, scenario mix, and resulting model metrics have been read back from Colab.</w:t>
+      </w:r>
+    </w:p>
+    <w:p>
+      <w:pPr>
+        <w:pStyle w:val="Heading1"/>
+        <w:keepNext/>
+        <w:pageBreakBefore/>
+        <w:spacing w:before="240" w:after="80"/>
+      </w:pPr>
+      <w:r>
+        <w:rPr>
+          <w:rFonts w:ascii="Arial" w:hAnsi="Arial"/>
+          <w:b/>
+          <w:color w:val="2E75B6"/>
+          <w:sz w:val="40"/>
+        </w:rPr>
+        <w:t>12. References</w:t>
+      </w:r>
+    </w:p>
+    <w:p>
+      <w:pPr>
+        <w:spacing w:after="120" w:line="269" w:lineRule="auto"/>
+      </w:pPr>
+      <w:r>
+        <w:rPr>
+          <w:rFonts w:ascii="Arial" w:hAnsi="Arial"/>
+          <w:i w:val="0"/>
+          <w:color w:val="000000"/>
+          <w:sz w:val="22"/>
+        </w:rPr>
+        <w:t>The following sources were consulted in the preparation of this report. The reference list is intentionally limited to eight sources, including the public-domain Kaggle dataset used for the analysis.</w:t>
+      </w:r>
+    </w:p>
+    <w:p>
+      <w:pPr>
+        <w:spacing w:after="120" w:line="269" w:lineRule="auto"/>
+      </w:pPr>
+      <w:r>
+        <w:rPr>
+          <w:rFonts w:ascii="Arial" w:hAnsi="Arial"/>
+          <w:i w:val="0"/>
           <w:color w:val="000000"/>
           <w:sz w:val="22"/>
         </w:rPr>
@@ -20116,15 +20328,40 @@
     </w:p>
     <w:p>
       <w:pPr>
-        <w:numPr>
-          <w:ilvl w:val="0"/>
-          <w:numId w:val="3"/>
-        </w:numPr>
-        <w:spacing w:after="60" w:line="259" w:lineRule="auto"/>
+        <w:spacing w:after="120" w:line="269" w:lineRule="auto"/>
       </w:pPr>
       <w:r>
         <w:rPr>
           <w:rFonts w:ascii="Arial" w:hAnsi="Arial"/>
+          <w:i w:val="0"/>
+          <w:color w:val="000000"/>
+          <w:sz w:val="22"/>
+        </w:rPr>
+        <w:t>Circuit Digest (2025). BMP280 Sensor Module Working and Arduino Interfacing Guide. https://circuitdigest.com/microcontroller-projects/interfacing-bmp280-sensor-with-arduino</w:t>
+      </w:r>
+    </w:p>
+    <w:p>
+      <w:pPr>
+        <w:spacing w:after="120" w:line="269" w:lineRule="auto"/>
+      </w:pPr>
+      <w:r>
+        <w:rPr>
+          <w:rFonts w:ascii="Arial" w:hAnsi="Arial"/>
+          <w:i w:val="0"/>
+          <w:color w:val="000000"/>
+          <w:sz w:val="22"/>
+        </w:rPr>
+        <w:t>Eaton Corporation (2024). Energy Consumption in Data Centers: Air versus Liquid Cooling. https://www.eaton.com/us/en-us/markets/data-centers/data-center-cooling/efficiency/energy-consumption-in-data-centers-air-versus-liquid-cooling.html</w:t>
+      </w:r>
+    </w:p>
+    <w:p>
+      <w:pPr>
+        <w:spacing w:after="120" w:line="269" w:lineRule="auto"/>
+      </w:pPr>
+      <w:r>
+        <w:rPr>
+          <w:rFonts w:ascii="Arial" w:hAnsi="Arial"/>
+          <w:i w:val="0"/>
           <w:color w:val="000000"/>
           <w:sz w:val="22"/>
         </w:rPr>
@@ -20133,15 +20370,54 @@
     </w:p>
     <w:p>
       <w:pPr>
-        <w:numPr>
-          <w:ilvl w:val="0"/>
-          <w:numId w:val="3"/>
-        </w:numPr>
-        <w:spacing w:after="60" w:line="259" w:lineRule="auto"/>
+        <w:spacing w:after="120" w:line="269" w:lineRule="auto"/>
       </w:pPr>
       <w:r>
         <w:rPr>
           <w:rFonts w:ascii="Arial" w:hAnsi="Arial"/>
+          <w:i w:val="0"/>
+          <w:color w:val="000000"/>
+          <w:sz w:val="22"/>
+        </w:rPr>
+        <w:t>Microsoft Azure (2024, December 9). Sustainable by Design: Next-Generation Datacenters Consume Zero Water for Cooling. Microsoft Cloud Blog. https://www.microsoft.com/en-us/microsoft-cloud/blog/2024/12/09/sustainable-by-design-next-generation-datacenters-consume-zero-water-for-cooling/</w:t>
+      </w:r>
+    </w:p>
+    <w:p>
+      <w:pPr>
+        <w:spacing w:after="120" w:line="269" w:lineRule="auto"/>
+      </w:pPr>
+      <w:r>
+        <w:rPr>
+          <w:rFonts w:ascii="Arial" w:hAnsi="Arial"/>
+          <w:i w:val="0"/>
+          <w:color w:val="000000"/>
+          <w:sz w:val="22"/>
+        </w:rPr>
+        <w:t>programmer3 (2023). Data Center Cold Source Control Dataset. Kaggle. https://www.kaggle.com/datasets/programmer3/data-center-cold-source-control-dataset</w:t>
+      </w:r>
+    </w:p>
+    <w:p>
+      <w:pPr>
+        <w:spacing w:after="120" w:line="269" w:lineRule="auto"/>
+      </w:pPr>
+      <w:r>
+        <w:rPr>
+          <w:rFonts w:ascii="Arial" w:hAnsi="Arial"/>
+          <w:i w:val="0"/>
+          <w:color w:val="000000"/>
+          <w:sz w:val="22"/>
+        </w:rPr>
+        <w:t>TechTarget (2025, updated). Data Center Cooling Systems and Technologies and How They Work. SearchDataCenter. https://www.techtarget.com/searchdatacenter/tip/Data-center-cooling-systems-and-technologies-and-how-they-work</w:t>
+      </w:r>
+    </w:p>
+    <w:p>
+      <w:pPr>
+        <w:spacing w:after="120" w:line="269" w:lineRule="auto"/>
+      </w:pPr>
+      <w:r>
+        <w:rPr>
+          <w:rFonts w:ascii="Arial" w:hAnsi="Arial"/>
+          <w:i w:val="0"/>
           <w:color w:val="000000"/>
           <w:sz w:val="22"/>
         </w:rPr>
@@ -20149,239 +20425,8 @@
       </w:r>
     </w:p>
     <w:p>
-      <w:pPr>
-        <w:numPr>
-          <w:ilvl w:val="0"/>
-          <w:numId w:val="3"/>
-        </w:numPr>
-        <w:spacing w:after="60" w:line="259" w:lineRule="auto"/>
-      </w:pPr>
-      <w:r>
-        <w:rPr>
-          <w:rFonts w:ascii="Arial" w:hAnsi="Arial"/>
-          <w:color w:val="000000"/>
-          <w:sz w:val="22"/>
-        </w:rPr>
-        <w:t>U.S. Environmental Protection Agency (2025). Data Center Energy Usage Report. EPA. Cited in MOST Policy Initiative: https://mostpolicyinitiative.org/science-note/data-center-water-use/</w:t>
-      </w:r>
-    </w:p>
-    <w:p>
-      <w:pPr>
-        <w:numPr>
-          <w:ilvl w:val="0"/>
-          <w:numId w:val="3"/>
-        </w:numPr>
-        <w:spacing w:after="60" w:line="259" w:lineRule="auto"/>
-      </w:pPr>
-      <w:r>
-        <w:rPr>
-          <w:rFonts w:ascii="Arial" w:hAnsi="Arial"/>
-          <w:color w:val="000000"/>
-          <w:sz w:val="22"/>
-        </w:rPr>
-        <w:t>Microsoft Azure (2024, December 9). Sustainable by Design: Next-Generation Datacenters Consume Zero Water for Cooling. Microsoft Cloud Blog. https://www.microsoft.com/en-us/microsoft-cloud/blog/2024/12/09/sustainable-by-design-next-generation-datacenters-consume-zero-water-for-cooling/</w:t>
-      </w:r>
-    </w:p>
-    <w:p>
-      <w:pPr>
-        <w:numPr>
-          <w:ilvl w:val="0"/>
-          <w:numId w:val="3"/>
-        </w:numPr>
-        <w:spacing w:after="60" w:line="259" w:lineRule="auto"/>
-      </w:pPr>
-      <w:r>
-        <w:rPr>
-          <w:rFonts w:ascii="Arial" w:hAnsi="Arial"/>
-          <w:color w:val="000000"/>
-          <w:sz w:val="22"/>
-        </w:rPr>
-        <w:t>Energy, Environment, and Security Initiative (EESI) (2024). Data Center Energy Needs Could Upend Power Grids and Threaten the Climate. https://www.eesi.org/articles/view/data-center-energy-needs-are-upending-power-grids-and-threatening-the-climate</w:t>
-      </w:r>
-    </w:p>
-    <w:p>
-      <w:pPr>
-        <w:numPr>
-          <w:ilvl w:val="0"/>
-          <w:numId w:val="3"/>
-        </w:numPr>
-        <w:spacing w:after="60" w:line="259" w:lineRule="auto"/>
-      </w:pPr>
-      <w:r>
-        <w:rPr>
-          <w:rFonts w:ascii="Arial" w:hAnsi="Arial"/>
-          <w:color w:val="000000"/>
-          <w:sz w:val="22"/>
-        </w:rPr>
-        <w:t>TechTarget (2025, updated). Data Center Cooling Systems and Technologies and How They Work. SearchDataCenter. https://www.techtarget.com/searchdatacenter/tip/Data-center-cooling-systems-and-technologies-and-how-they-work</w:t>
-      </w:r>
-    </w:p>
-    <w:p>
-      <w:pPr>
-        <w:numPr>
-          <w:ilvl w:val="0"/>
-          <w:numId w:val="3"/>
-        </w:numPr>
-        <w:spacing w:after="60" w:line="259" w:lineRule="auto"/>
-      </w:pPr>
-      <w:r>
-        <w:rPr>
-          <w:rFonts w:ascii="Arial" w:hAnsi="Arial"/>
-          <w:color w:val="000000"/>
-          <w:sz w:val="22"/>
-        </w:rPr>
-        <w:t>Tom's Hardware (2025, December 16). The Data Center Cooling State of Play (2025). https://www.tomshardware.com/pc-components/cooling/the-data-center-cooling-state-of-play-2025</w:t>
-      </w:r>
-    </w:p>
-    <w:p>
-      <w:pPr>
-        <w:numPr>
-          <w:ilvl w:val="0"/>
-          <w:numId w:val="3"/>
-        </w:numPr>
-        <w:spacing w:after="60" w:line="259" w:lineRule="auto"/>
-      </w:pPr>
-      <w:r>
-        <w:rPr>
-          <w:rFonts w:ascii="Arial" w:hAnsi="Arial"/>
-          <w:color w:val="000000"/>
-          <w:sz w:val="22"/>
-        </w:rPr>
-        <w:t>Eaton Corporation (2024). Energy Consumption in Data Centers: Air versus Liquid Cooling. https://www.eaton.com/us/en-us/markets/data-centers/data-center-cooling/efficiency/energy-consumption-in-data-centers-air-versus-liquid-cooling.html</w:t>
-      </w:r>
-    </w:p>
-    <w:p>
-      <w:pPr>
-        <w:numPr>
-          <w:ilvl w:val="0"/>
-          <w:numId w:val="3"/>
-        </w:numPr>
-        <w:spacing w:after="60" w:line="259" w:lineRule="auto"/>
-      </w:pPr>
-      <w:r>
-        <w:rPr>
-          <w:rFonts w:ascii="Arial" w:hAnsi="Arial"/>
-          <w:color w:val="000000"/>
-          <w:sz w:val="22"/>
-        </w:rPr>
-        <w:t>Park Place Technologies (2024, December 2). Data Center Cooling Systems – Benefits, Differences and Comparisons. https://www.parkplacetechnologies.com/blog/data-center-cooling-systems-benefits-comparisons/</w:t>
-      </w:r>
-    </w:p>
-    <w:p>
-      <w:pPr>
-        <w:numPr>
-          <w:ilvl w:val="0"/>
-          <w:numId w:val="3"/>
-        </w:numPr>
-        <w:spacing w:after="60" w:line="259" w:lineRule="auto"/>
-      </w:pPr>
-      <w:r>
-        <w:rPr>
-          <w:rFonts w:ascii="Arial" w:hAnsi="Arial"/>
-          <w:color w:val="000000"/>
-          <w:sz w:val="22"/>
-        </w:rPr>
-        <w:t>Sunbird DCIM (2024). Data Center Temperature and Humidity Standards. https://www.sunbirddcim.com/glossary/data-center-temperature-and-humidity-standards</w:t>
-      </w:r>
-    </w:p>
-    <w:p>
-      <w:pPr>
-        <w:numPr>
-          <w:ilvl w:val="0"/>
-          <w:numId w:val="3"/>
-        </w:numPr>
-        <w:spacing w:after="60" w:line="259" w:lineRule="auto"/>
-      </w:pPr>
-      <w:r>
-        <w:rPr>
-          <w:rFonts w:ascii="Arial" w:hAnsi="Arial"/>
-          <w:color w:val="000000"/>
-          <w:sz w:val="22"/>
-        </w:rPr>
-        <w:t>AKCP (2024, April 2). Data Center Temperature Sensors: Optimizing Efficiency. https://www.akcp.com/index.php/2024/04/02/data-center-temperature-sensors/</w:t>
-      </w:r>
-    </w:p>
-    <w:p>
-      <w:pPr>
-        <w:numPr>
-          <w:ilvl w:val="0"/>
-          <w:numId w:val="3"/>
-        </w:numPr>
-        <w:spacing w:after="60" w:line="259" w:lineRule="auto"/>
-      </w:pPr>
-      <w:r>
-        <w:rPr>
-          <w:rFonts w:ascii="Arial" w:hAnsi="Arial"/>
-          <w:color w:val="000000"/>
-          <w:sz w:val="22"/>
-        </w:rPr>
-        <w:t>Circuit Digest (2025). BMP280 Sensor Module Working and Arduino Interfacing Guide. https://circuitdigest.com/microcontroller-projects/interfacing-bmp280-sensor-with-arduino</w:t>
-      </w:r>
-    </w:p>
-    <w:p>
-      <w:pPr>
-        <w:numPr>
-          <w:ilvl w:val="0"/>
-          <w:numId w:val="3"/>
-        </w:numPr>
-        <w:spacing w:after="60" w:line="259" w:lineRule="auto"/>
-      </w:pPr>
-      <w:r>
-        <w:rPr>
-          <w:rFonts w:ascii="Arial" w:hAnsi="Arial"/>
-          <w:color w:val="000000"/>
-          <w:sz w:val="22"/>
-        </w:rPr>
-        <w:t>ComponentIndex (2026, March 11). DHT22 Sensor Guide: Wiring, Code &amp; Pinout for Arduino. https://componentindex.net/components/dht22/</w:t>
-      </w:r>
-    </w:p>
-    <w:p>
-      <w:pPr>
-        <w:numPr>
-          <w:ilvl w:val="0"/>
-          <w:numId w:val="3"/>
-        </w:numPr>
-        <w:spacing w:after="60" w:line="259" w:lineRule="auto"/>
-      </w:pPr>
-      <w:r>
-        <w:rPr>
-          <w:rFonts w:ascii="Arial" w:hAnsi="Arial"/>
-          <w:color w:val="000000"/>
-          <w:sz w:val="22"/>
-        </w:rPr>
-        <w:t>programmer3 (2023). Data Center Cold Source Control Dataset. Kaggle. https://www.kaggle.com/datasets/programmer3/data-center-cold-source-control-dataset</w:t>
-      </w:r>
-    </w:p>
-    <w:p>
-      <w:pPr>
-        <w:numPr>
-          <w:ilvl w:val="0"/>
-          <w:numId w:val="3"/>
-        </w:numPr>
-        <w:spacing w:after="60" w:line="259" w:lineRule="auto"/>
-      </w:pPr>
-      <w:r>
-        <w:rPr>
-          <w:rFonts w:ascii="Arial" w:hAnsi="Arial"/>
-          <w:color w:val="000000"/>
-          <w:sz w:val="22"/>
-        </w:rPr>
-        <w:t>Hanwha Data Centers (2025). Data Center Energy Efficiency Best Practices. https://www.hanwhadatacenters.com/blog/data-center-energy-efficiency-best-practices/</w:t>
-      </w:r>
-    </w:p>
-    <w:p>
-      <w:pPr>
-        <w:spacing w:after="120" w:line="269" w:lineRule="auto"/>
-        <w:jc w:val="center"/>
-      </w:pPr>
-      <w:r>
-        <w:rPr>
-          <w:rFonts w:ascii="Arial" w:hAnsi="Arial"/>
-          <w:i/>
-          <w:color w:val="000000"/>
-          <w:sz w:val="22"/>
-        </w:rPr>
-        <w:t>End of Report</w:t>
+      <w:r>
+        <w:br w:type="page"/>
       </w:r>
     </w:p>
     <w:sectPr>

</xml_diff>